<commit_message>
Compte rendu final séances A et B : cibles RTO/RPO justifiées, calculs vérifiés
</commit_message>
<xml_diff>
--- a/docs/TP_HAPCA_Santelia_Charles.docx
+++ b/docs/TP_HAPCA_Santelia_Charles.docx
@@ -39,7 +39,7 @@
         <w:rPr>
           <w:b w:val="0"/>
         </w:rPr>
-        <w:t>Séance A : lundi 5 octobre 2026 — Parties 1 et 2. Séance B : jeudi 8 octobre 2026 — Parties 3 et 4.</w:t>
+        <w:t>Séance A : lundi 5 octobre 2026 — Parties 1 et 2. Jeudi 8 octobre 2026 — Parties 3 et 4.</w:t>
       </w:r>
     </w:p>
     <w:p>
@@ -226,7 +226,7 @@
           </w:tcPr>
           <w:p>
             <w:r>
-              <w:t>Terminé (RTO : 2 min 17 s)</w:t>
+              <w:t>Terminé (RTO : 2 min 17 s, cible 15 min : conforme)</w:t>
             </w:r>
           </w:p>
         </w:tc>
@@ -2802,7 +2802,7 @@
           </w:tcPr>
           <w:p>
             <w:r>
-              <w:t>RTO cible de notre CDC</w:t>
+              <w:t>Calcul</w:t>
             </w:r>
           </w:p>
         </w:tc>
@@ -2812,7 +2812,29 @@
           </w:tcPr>
           <w:p>
             <w:r>
-              <w:t>Non chiffré dans le CDC (« à confirmer avec le client »)</w:t>
+              <w:t>11:53:56 − 11:51:39 = 2 min 17 s (137 s)</w:t>
+            </w:r>
+          </w:p>
+        </w:tc>
+      </w:tr>
+      <w:tr>
+        <w:tc>
+          <w:tcPr>
+            <w:tcW w:type="dxa" w:w="4986"/>
+          </w:tcPr>
+          <w:p>
+            <w:r>
+              <w:t>RTO cible (fixée par le groupe, voir ci-dessous)</w:t>
+            </w:r>
+          </w:p>
+        </w:tc>
+        <w:tc>
+          <w:tcPr>
+            <w:tcW w:type="dxa" w:w="4986"/>
+          </w:tcPr>
+          <w:p>
+            <w:r>
+              <w:t>15 min</w:t>
             </w:r>
           </w:p>
         </w:tc>
@@ -2834,13 +2856,29 @@
           </w:tcPr>
           <w:p>
             <w:r>
-              <w:t>Non calculable ; pour comparaison, la panne de mars à Évry a duré plus de 6 h</w:t>
+              <w:t>15 min − 2 min 17 s = 12 min 43 s de marge : CONFORME</w:t>
             </w:r>
           </w:p>
         </w:tc>
       </w:tr>
     </w:tbl>
     <w:p/>
+    <w:p>
+      <w:r>
+        <w:rPr>
+          <w:b w:val="0"/>
+        </w:rPr>
+        <w:t>Preuves : t0 est lisible sur la capture ha-manager status (« lrm pve2 (old timestamp - dead?, … 11:51:39) ») ; t1 et t2 sont lisibles sur la capture du journal HA (« recover service 'vm:100' … 11:53:52 » et « VM 100 started … 11:53:56 »). Calcul vérifié à la main : de 11:51:39 à 11:53:39 = 2 min, puis + 17 s = 2 min 17 s.</w:t>
+      </w:r>
+    </w:p>
+    <w:p>
+      <w:r>
+        <w:rPr>
+          <w:b w:val="0"/>
+        </w:rPr>
+        <w:t>Cible du CDC : notre CDC ne chiffre pas le RTO (« à confirmer avec le client »). Le groupe fixe donc la cible à 15 min pour la panne d'un nœud. Justification : la prise de rendez-vous en ligne est le service critique de Santélia ; la panne de mars l'a bloquée plus de 6 h ; une coupure de 15 min reste supportable pour les patients et l'accueil (prise de rendez-vous par téléphone pendant ce temps), et la HA relance la VM sans intervention de la DSI, qui ne compte que 2 personnes.</w:t>
+      </w:r>
+    </w:p>
     <w:p>
       <w:r>
         <w:rPr>
@@ -2994,7 +3032,7 @@
         <w:rPr>
           <w:b w:val="0"/>
         </w:rPr>
-        <w:t>Notre CDC ne fixe pas encore de RTO chiffré : il est noté « à confirmer avec le client ». Nous ne pouvons donc pas conclure de façon certaine. Notre RTO mesuré de 2 min 17 s est très inférieur à la panne de mars (plus de 6 h). Si la direction valide par exemple un RTO de 15 minutes pour les applications critiques, la solution le respecte. Si elle exigeait une coupure de moins d'une minute, il faudrait changer la solution technique (applications en mode actif-actif, répartition de charge), ce qui coûte plus cher.</w:t>
+        <w:t>Notre CDC ne chiffrait pas le RTO ; le groupe a fixé la cible à 15 min pour la panne d'un nœud (justification ci-dessus, Partie 4.2). RTO mesuré : 2 min 17 s, soit 12 min 43 s de marge : la cible est respectée, il n'y a rien à changer. Si la direction exigeait une coupure de moins d'une minute, il faudrait changer la solution technique (applications en mode actif-actif, répartition de charge), car l'attente de sécurité (fencing) de la HA dure à elle seule environ 2 minutes.</w:t>
       </w:r>
     </w:p>
     <w:p>

</xml_diff>